<commit_message>
Agregué interacciones con la IA
</commit_message>
<xml_diff>
--- a/TPI Organizacion Empresarial.docx
+++ b/TPI Organizacion Empresarial.docx
@@ -333,7 +333,21 @@
         <w:rPr>
           <w:rtl w:val="0"/>
         </w:rPr>
-        <w:t xml:space="preserve">Prof. Carolina Bruno, Prof. Mario Raúl López, Prof. Andrea Ramos, Prof. Alejandro Lencinas (adjuntos).</w:t>
+        <w:t xml:space="preserve">Prof. Carolina Bruno, Prof. Mario Raúl López, Prof. Andrea Ramos, </w:t>
+      </w:r>
+      <w:r>
+        <w:rPr>
+          <w:sz w:val="24"/>
+          <w:szCs w:val="24"/>
+          <w:rtl w:val="0"/>
+        </w:rPr>
+        <w:t xml:space="preserve">Prof. Alejandro Lencinas</w:t>
+      </w:r>
+      <w:r>
+        <w:rPr>
+          <w:rtl w:val="0"/>
+        </w:rPr>
+        <w:t xml:space="preserve"> (adjuntos).</w:t>
       </w:r>
     </w:p>
     <w:p>
@@ -582,6 +596,262 @@
           <w:rtl w:val="0"/>
         </w:rPr>
         <w:t xml:space="preserve">Este proceso manual genera varios problemas:</w:t>
+      </w:r>
+      <w:r>
+        <w:rPr>
+          <w:rtl w:val="0"/>
+        </w:rPr>
+      </w:r>
+    </w:p>
+    <w:p>
+      <w:pPr>
+        <w:keepNext w:val="0"/>
+        <w:keepLines w:val="0"/>
+        <w:pageBreakBefore w:val="0"/>
+        <w:widowControl w:val="1"/>
+        <w:numPr>
+          <w:ilvl w:val="0"/>
+          <w:numId w:val="2"/>
+        </w:numPr>
+        <w:pBdr>
+          <w:top w:space="0" w:sz="0" w:val="nil"/>
+          <w:left w:space="0" w:sz="0" w:val="nil"/>
+          <w:bottom w:space="0" w:sz="0" w:val="nil"/>
+          <w:right w:space="0" w:sz="0" w:val="nil"/>
+          <w:between w:space="0" w:sz="0" w:val="nil"/>
+        </w:pBdr>
+        <w:shd w:fill="auto" w:val="clear"/>
+        <w:spacing w:after="60" w:before="0" w:line="240" w:lineRule="auto"/>
+        <w:ind w:left="560" w:right="0" w:hanging="280"/>
+        <w:jc w:val="left"/>
+        <w:rPr/>
+      </w:pPr>
+      <w:r>
+        <w:rPr>
+          <w:rFonts w:ascii="Times New Roman" w:cs="Times New Roman" w:eastAsia="Times New Roman" w:hAnsi="Times New Roman"/>
+          <w:b w:val="0"/>
+          <w:bCs w:val="0"/>
+          <w:i w:val="0"/>
+          <w:iCs w:val="0"/>
+          <w:smallCaps w:val="0"/>
+          <w:strike w:val="0"/>
+          <w:color w:val="000000"/>
+          <w:sz w:val="22"/>
+          <w:szCs w:val="22"/>
+          <w:u w:val="none"/>
+          <w:shd w:fill="auto" w:val="clear"/>
+          <w:vertAlign w:val="baseline"/>
+          <w:rtl w:val="0"/>
+        </w:rPr>
+        <w:t xml:space="preserve">Es lento: depende de que las personas revisen y reenvíen correos.</w:t>
+      </w:r>
+      <w:r>
+        <w:rPr>
+          <w:rtl w:val="0"/>
+        </w:rPr>
+      </w:r>
+    </w:p>
+    <w:p>
+      <w:pPr>
+        <w:keepNext w:val="0"/>
+        <w:keepLines w:val="0"/>
+        <w:pageBreakBefore w:val="0"/>
+        <w:widowControl w:val="1"/>
+        <w:numPr>
+          <w:ilvl w:val="0"/>
+          <w:numId w:val="2"/>
+        </w:numPr>
+        <w:pBdr>
+          <w:top w:space="0" w:sz="0" w:val="nil"/>
+          <w:left w:space="0" w:sz="0" w:val="nil"/>
+          <w:bottom w:space="0" w:sz="0" w:val="nil"/>
+          <w:right w:space="0" w:sz="0" w:val="nil"/>
+          <w:between w:space="0" w:sz="0" w:val="nil"/>
+        </w:pBdr>
+        <w:shd w:fill="auto" w:val="clear"/>
+        <w:spacing w:after="60" w:before="0" w:line="240" w:lineRule="auto"/>
+        <w:ind w:left="560" w:right="0" w:hanging="280"/>
+        <w:jc w:val="left"/>
+        <w:rPr/>
+      </w:pPr>
+      <w:r>
+        <w:rPr>
+          <w:rFonts w:ascii="Times New Roman" w:cs="Times New Roman" w:eastAsia="Times New Roman" w:hAnsi="Times New Roman"/>
+          <w:b w:val="0"/>
+          <w:bCs w:val="0"/>
+          <w:i w:val="0"/>
+          <w:iCs w:val="0"/>
+          <w:smallCaps w:val="0"/>
+          <w:strike w:val="0"/>
+          <w:color w:val="000000"/>
+          <w:sz w:val="22"/>
+          <w:szCs w:val="22"/>
+          <w:u w:val="none"/>
+          <w:shd w:fill="auto" w:val="clear"/>
+          <w:vertAlign w:val="baseline"/>
+          <w:rtl w:val="0"/>
+        </w:rPr>
+        <w:t xml:space="preserve">Se cargan datos con errores (CUIT mal tipeados, campos incompletos).</w:t>
+      </w:r>
+      <w:r>
+        <w:rPr>
+          <w:rtl w:val="0"/>
+        </w:rPr>
+      </w:r>
+    </w:p>
+    <w:p>
+      <w:pPr>
+        <w:keepNext w:val="0"/>
+        <w:keepLines w:val="0"/>
+        <w:pageBreakBefore w:val="0"/>
+        <w:widowControl w:val="1"/>
+        <w:numPr>
+          <w:ilvl w:val="0"/>
+          <w:numId w:val="2"/>
+        </w:numPr>
+        <w:pBdr>
+          <w:top w:space="0" w:sz="0" w:val="nil"/>
+          <w:left w:space="0" w:sz="0" w:val="nil"/>
+          <w:bottom w:space="0" w:sz="0" w:val="nil"/>
+          <w:right w:space="0" w:sz="0" w:val="nil"/>
+          <w:between w:space="0" w:sz="0" w:val="nil"/>
+        </w:pBdr>
+        <w:shd w:fill="auto" w:val="clear"/>
+        <w:spacing w:after="60" w:before="0" w:line="240" w:lineRule="auto"/>
+        <w:ind w:left="560" w:right="0" w:hanging="280"/>
+        <w:jc w:val="left"/>
+        <w:rPr/>
+      </w:pPr>
+      <w:r>
+        <w:rPr>
+          <w:rFonts w:ascii="Times New Roman" w:cs="Times New Roman" w:eastAsia="Times New Roman" w:hAnsi="Times New Roman"/>
+          <w:b w:val="0"/>
+          <w:bCs w:val="0"/>
+          <w:i w:val="0"/>
+          <w:iCs w:val="0"/>
+          <w:smallCaps w:val="0"/>
+          <w:strike w:val="0"/>
+          <w:color w:val="000000"/>
+          <w:sz w:val="22"/>
+          <w:szCs w:val="22"/>
+          <w:u w:val="none"/>
+          <w:shd w:fill="auto" w:val="clear"/>
+          <w:vertAlign w:val="baseline"/>
+          <w:rtl w:val="0"/>
+        </w:rPr>
+        <w:t xml:space="preserve">Se generan proveedores duplicados, porque nadie controla si el CUIT ya existe.</w:t>
+      </w:r>
+      <w:r>
+        <w:rPr>
+          <w:rtl w:val="0"/>
+        </w:rPr>
+      </w:r>
+    </w:p>
+    <w:p>
+      <w:pPr>
+        <w:keepNext w:val="0"/>
+        <w:keepLines w:val="0"/>
+        <w:pageBreakBefore w:val="0"/>
+        <w:widowControl w:val="1"/>
+        <w:numPr>
+          <w:ilvl w:val="0"/>
+          <w:numId w:val="2"/>
+        </w:numPr>
+        <w:pBdr>
+          <w:top w:space="0" w:sz="0" w:val="nil"/>
+          <w:left w:space="0" w:sz="0" w:val="nil"/>
+          <w:bottom w:space="0" w:sz="0" w:val="nil"/>
+          <w:right w:space="0" w:sz="0" w:val="nil"/>
+          <w:between w:space="0" w:sz="0" w:val="nil"/>
+        </w:pBdr>
+        <w:shd w:fill="auto" w:val="clear"/>
+        <w:spacing w:after="60" w:before="0" w:line="240" w:lineRule="auto"/>
+        <w:ind w:left="560" w:right="0" w:hanging="280"/>
+        <w:jc w:val="left"/>
+        <w:rPr/>
+      </w:pPr>
+      <w:r>
+        <w:rPr>
+          <w:rFonts w:ascii="Times New Roman" w:cs="Times New Roman" w:eastAsia="Times New Roman" w:hAnsi="Times New Roman"/>
+          <w:b w:val="0"/>
+          <w:bCs w:val="0"/>
+          <w:i w:val="0"/>
+          <w:iCs w:val="0"/>
+          <w:smallCaps w:val="0"/>
+          <w:strike w:val="0"/>
+          <w:color w:val="000000"/>
+          <w:sz w:val="22"/>
+          <w:szCs w:val="22"/>
+          <w:u w:val="none"/>
+          <w:shd w:fill="auto" w:val="clear"/>
+          <w:vertAlign w:val="baseline"/>
+          <w:rtl w:val="0"/>
+        </w:rPr>
+        <w:t xml:space="preserve">Falta trazabilidad: no queda registro claro de quién aprobó qué y cuándo.</w:t>
+      </w:r>
+      <w:r>
+        <w:rPr>
+          <w:rtl w:val="0"/>
+        </w:rPr>
+      </w:r>
+    </w:p>
+    <w:p>
+      <w:pPr>
+        <w:pStyle w:val="Heading1"/>
+        <w:rPr/>
+      </w:pPr>
+      <w:r>
+        <w:rPr>
+          <w:rFonts w:ascii="Times New Roman" w:cs="Times New Roman" w:eastAsia="Times New Roman" w:hAnsi="Times New Roman"/>
+          <w:b w:val="1"/>
+          <w:bCs w:val="1"/>
+          <w:sz w:val="24"/>
+          <w:szCs w:val="24"/>
+          <w:rtl w:val="0"/>
+        </w:rPr>
+        <w:t xml:space="preserve">4. PROPUESTA DE SOLUCIÓN (TO-BE)</w:t>
+      </w:r>
+      <w:r>
+        <w:rPr>
+          <w:rtl w:val="0"/>
+        </w:rPr>
+      </w:r>
+    </w:p>
+    <w:p>
+      <w:pPr>
+        <w:spacing w:after="120" w:line="276" w:lineRule="auto"/>
+        <w:jc w:val="both"/>
+        <w:rPr/>
+      </w:pPr>
+      <w:r>
+        <w:rPr>
+          <w:rFonts w:ascii="Times New Roman" w:cs="Times New Roman" w:eastAsia="Times New Roman" w:hAnsi="Times New Roman"/>
+          <w:sz w:val="22"/>
+          <w:szCs w:val="22"/>
+          <w:rtl w:val="0"/>
+        </w:rPr>
+        <w:t xml:space="preserve">Proponemos reemplazar el circuito manual por un chatbot que guíe el alta paso a paso. El bot le pide los datos al usuario uno por uno, valida cada dato en el momento (formato y duplicados), consulta la base de datos y, según las reglas de negocio, decide automáticamente el resultado o deriva la solicitud al Responsable de Compras.</w:t>
+      </w:r>
+      <w:r>
+        <w:rPr>
+          <w:rtl w:val="0"/>
+        </w:rPr>
+      </w:r>
+    </w:p>
+    <w:p>
+      <w:pPr>
+        <w:spacing w:after="120" w:line="276" w:lineRule="auto"/>
+        <w:jc w:val="both"/>
+        <w:rPr/>
+      </w:pPr>
+      <w:r>
+        <w:rPr>
+          <w:rFonts w:ascii="Times New Roman" w:cs="Times New Roman" w:eastAsia="Times New Roman" w:hAnsi="Times New Roman"/>
+          <w:sz w:val="22"/>
+          <w:szCs w:val="22"/>
+          <w:rtl w:val="0"/>
+        </w:rPr>
+        <w:t xml:space="preserve">Definimos tres reglas de negocio que se traducen en tres puntos de decisión (compuertas) del diagrama:</w:t>
       </w:r>
       <w:r>
         <w:rPr>
@@ -629,7 +899,7 @@
           <w:vertAlign w:val="baseline"/>
           <w:rtl w:val="0"/>
         </w:rPr>
-        <w:t xml:space="preserve">Es lento: depende de que las personas revisen y reenvíen correos.</w:t>
+        <w:t xml:space="preserve">¿El CUIT es válido y no está registrado? Si el formato es incorrecto, el bot vuelve a pedirlo; si el CUIT ya existe, rechaza el alta para evitar duplicados.</w:t>
       </w:r>
       <w:r>
         <w:rPr>
@@ -677,7 +947,7 @@
           <w:vertAlign w:val="baseline"/>
           <w:rtl w:val="0"/>
         </w:rPr>
-        <w:t xml:space="preserve">Se cargan datos con errores (CUIT mal tipeados, campos incompletos).</w:t>
+        <w:t xml:space="preserve">¿El monto estimado anual supera el umbral de $500.000? Si no lo supera, el alta es automática; si lo supera, se deriva a aprobación.</w:t>
       </w:r>
       <w:r>
         <w:rPr>
@@ -725,55 +995,7 @@
           <w:vertAlign w:val="baseline"/>
           <w:rtl w:val="0"/>
         </w:rPr>
-        <w:t xml:space="preserve">Se generan proveedores duplicados, porque nadie controla si el CUIT ya existe.</w:t>
-      </w:r>
-      <w:r>
-        <w:rPr>
-          <w:rtl w:val="0"/>
-        </w:rPr>
-      </w:r>
-    </w:p>
-    <w:p>
-      <w:pPr>
-        <w:keepNext w:val="0"/>
-        <w:keepLines w:val="0"/>
-        <w:pageBreakBefore w:val="0"/>
-        <w:widowControl w:val="1"/>
-        <w:numPr>
-          <w:ilvl w:val="0"/>
-          <w:numId w:val="3"/>
-        </w:numPr>
-        <w:pBdr>
-          <w:top w:space="0" w:sz="0" w:val="nil"/>
-          <w:left w:space="0" w:sz="0" w:val="nil"/>
-          <w:bottom w:space="0" w:sz="0" w:val="nil"/>
-          <w:right w:space="0" w:sz="0" w:val="nil"/>
-          <w:between w:space="0" w:sz="0" w:val="nil"/>
-        </w:pBdr>
-        <w:shd w:fill="auto" w:val="clear"/>
-        <w:spacing w:after="60" w:before="0" w:line="240" w:lineRule="auto"/>
-        <w:ind w:left="560" w:right="0" w:hanging="280"/>
-        <w:jc w:val="left"/>
-        <w:rPr/>
-      </w:pPr>
-      <w:r>
-        <w:rPr>
-          <w:rFonts w:ascii="Times New Roman" w:cs="Times New Roman" w:eastAsia="Times New Roman" w:hAnsi="Times New Roman"/>
-          <w:b w:val="0"/>
-          <w:bCs w:val="0"/>
-          <w:i w:val="0"/>
-          <w:iCs w:val="0"/>
-          <w:smallCaps w:val="0"/>
-          <w:strike w:val="0"/>
-          <w:color w:val="000000"/>
-          <w:sz w:val="22"/>
-          <w:szCs w:val="22"/>
-          <w:u w:val="none"/>
-          <w:shd w:fill="auto" w:val="clear"/>
-          <w:vertAlign w:val="baseline"/>
-          <w:rtl w:val="0"/>
-        </w:rPr>
-        <w:t xml:space="preserve">Falta trazabilidad: no queda registro claro de quién aprobó qué y cuándo.</w:t>
+        <w:t xml:space="preserve">¿El Responsable de Compras aprueba la solicitud? Si aprueba, el proveedor queda Activo; si no, queda Rechazado.</w:t>
       </w:r>
       <w:r>
         <w:rPr>
@@ -795,214 +1017,6 @@
           <w:szCs w:val="24"/>
           <w:rtl w:val="0"/>
         </w:rPr>
-        <w:t xml:space="preserve">4. PROPUESTA DE SOLUCIÓN (TO-BE)</w:t>
-      </w:r>
-      <w:r>
-        <w:rPr>
-          <w:rtl w:val="0"/>
-        </w:rPr>
-      </w:r>
-    </w:p>
-    <w:p>
-      <w:pPr>
-        <w:spacing w:after="120" w:line="276" w:lineRule="auto"/>
-        <w:jc w:val="both"/>
-        <w:rPr/>
-      </w:pPr>
-      <w:r>
-        <w:rPr>
-          <w:rFonts w:ascii="Times New Roman" w:cs="Times New Roman" w:eastAsia="Times New Roman" w:hAnsi="Times New Roman"/>
-          <w:sz w:val="22"/>
-          <w:szCs w:val="22"/>
-          <w:rtl w:val="0"/>
-        </w:rPr>
-        <w:t xml:space="preserve">Proponemos reemplazar el circuito manual por un chatbot que guíe el alta paso a paso. El bot le pide los datos al usuario uno por uno, valida cada dato en el momento (formato y duplicados), consulta la base de datos y, según las reglas de negocio, decide automáticamente el resultado o deriva la solicitud al Responsable de Compras.</w:t>
-      </w:r>
-      <w:r>
-        <w:rPr>
-          <w:rtl w:val="0"/>
-        </w:rPr>
-      </w:r>
-    </w:p>
-    <w:p>
-      <w:pPr>
-        <w:spacing w:after="120" w:line="276" w:lineRule="auto"/>
-        <w:jc w:val="both"/>
-        <w:rPr/>
-      </w:pPr>
-      <w:r>
-        <w:rPr>
-          <w:rFonts w:ascii="Times New Roman" w:cs="Times New Roman" w:eastAsia="Times New Roman" w:hAnsi="Times New Roman"/>
-          <w:sz w:val="22"/>
-          <w:szCs w:val="22"/>
-          <w:rtl w:val="0"/>
-        </w:rPr>
-        <w:t xml:space="preserve">Definimos tres reglas de negocio que se traducen en tres puntos de decisión (compuertas) del diagrama:</w:t>
-      </w:r>
-      <w:r>
-        <w:rPr>
-          <w:rtl w:val="0"/>
-        </w:rPr>
-      </w:r>
-    </w:p>
-    <w:p>
-      <w:pPr>
-        <w:keepNext w:val="0"/>
-        <w:keepLines w:val="0"/>
-        <w:pageBreakBefore w:val="0"/>
-        <w:widowControl w:val="1"/>
-        <w:numPr>
-          <w:ilvl w:val="0"/>
-          <w:numId w:val="4"/>
-        </w:numPr>
-        <w:pBdr>
-          <w:top w:space="0" w:sz="0" w:val="nil"/>
-          <w:left w:space="0" w:sz="0" w:val="nil"/>
-          <w:bottom w:space="0" w:sz="0" w:val="nil"/>
-          <w:right w:space="0" w:sz="0" w:val="nil"/>
-          <w:between w:space="0" w:sz="0" w:val="nil"/>
-        </w:pBdr>
-        <w:shd w:fill="auto" w:val="clear"/>
-        <w:spacing w:after="60" w:before="0" w:line="240" w:lineRule="auto"/>
-        <w:ind w:left="560" w:right="0" w:hanging="280"/>
-        <w:jc w:val="left"/>
-        <w:rPr/>
-      </w:pPr>
-      <w:r>
-        <w:rPr>
-          <w:rFonts w:ascii="Times New Roman" w:cs="Times New Roman" w:eastAsia="Times New Roman" w:hAnsi="Times New Roman"/>
-          <w:b w:val="0"/>
-          <w:bCs w:val="0"/>
-          <w:i w:val="0"/>
-          <w:iCs w:val="0"/>
-          <w:smallCaps w:val="0"/>
-          <w:strike w:val="0"/>
-          <w:color w:val="000000"/>
-          <w:sz w:val="22"/>
-          <w:szCs w:val="22"/>
-          <w:u w:val="none"/>
-          <w:shd w:fill="auto" w:val="clear"/>
-          <w:vertAlign w:val="baseline"/>
-          <w:rtl w:val="0"/>
-        </w:rPr>
-        <w:t xml:space="preserve">¿El CUIT es válido y no está registrado? Si el formato es incorrecto, el bot vuelve a pedirlo; si el CUIT ya existe, rechaza el alta para evitar duplicados.</w:t>
-      </w:r>
-      <w:r>
-        <w:rPr>
-          <w:rtl w:val="0"/>
-        </w:rPr>
-      </w:r>
-    </w:p>
-    <w:p>
-      <w:pPr>
-        <w:keepNext w:val="0"/>
-        <w:keepLines w:val="0"/>
-        <w:pageBreakBefore w:val="0"/>
-        <w:widowControl w:val="1"/>
-        <w:numPr>
-          <w:ilvl w:val="0"/>
-          <w:numId w:val="4"/>
-        </w:numPr>
-        <w:pBdr>
-          <w:top w:space="0" w:sz="0" w:val="nil"/>
-          <w:left w:space="0" w:sz="0" w:val="nil"/>
-          <w:bottom w:space="0" w:sz="0" w:val="nil"/>
-          <w:right w:space="0" w:sz="0" w:val="nil"/>
-          <w:between w:space="0" w:sz="0" w:val="nil"/>
-        </w:pBdr>
-        <w:shd w:fill="auto" w:val="clear"/>
-        <w:spacing w:after="60" w:before="0" w:line="240" w:lineRule="auto"/>
-        <w:ind w:left="560" w:right="0" w:hanging="280"/>
-        <w:jc w:val="left"/>
-        <w:rPr/>
-      </w:pPr>
-      <w:r>
-        <w:rPr>
-          <w:rFonts w:ascii="Times New Roman" w:cs="Times New Roman" w:eastAsia="Times New Roman" w:hAnsi="Times New Roman"/>
-          <w:b w:val="0"/>
-          <w:bCs w:val="0"/>
-          <w:i w:val="0"/>
-          <w:iCs w:val="0"/>
-          <w:smallCaps w:val="0"/>
-          <w:strike w:val="0"/>
-          <w:color w:val="000000"/>
-          <w:sz w:val="22"/>
-          <w:szCs w:val="22"/>
-          <w:u w:val="none"/>
-          <w:shd w:fill="auto" w:val="clear"/>
-          <w:vertAlign w:val="baseline"/>
-          <w:rtl w:val="0"/>
-        </w:rPr>
-        <w:t xml:space="preserve">¿El monto estimado anual supera el umbral de $500.000? Si no lo supera, el alta es automática; si lo supera, se deriva a aprobación.</w:t>
-      </w:r>
-      <w:r>
-        <w:rPr>
-          <w:rtl w:val="0"/>
-        </w:rPr>
-      </w:r>
-    </w:p>
-    <w:p>
-      <w:pPr>
-        <w:keepNext w:val="0"/>
-        <w:keepLines w:val="0"/>
-        <w:pageBreakBefore w:val="0"/>
-        <w:widowControl w:val="1"/>
-        <w:numPr>
-          <w:ilvl w:val="0"/>
-          <w:numId w:val="4"/>
-        </w:numPr>
-        <w:pBdr>
-          <w:top w:space="0" w:sz="0" w:val="nil"/>
-          <w:left w:space="0" w:sz="0" w:val="nil"/>
-          <w:bottom w:space="0" w:sz="0" w:val="nil"/>
-          <w:right w:space="0" w:sz="0" w:val="nil"/>
-          <w:between w:space="0" w:sz="0" w:val="nil"/>
-        </w:pBdr>
-        <w:shd w:fill="auto" w:val="clear"/>
-        <w:spacing w:after="60" w:before="0" w:line="240" w:lineRule="auto"/>
-        <w:ind w:left="560" w:right="0" w:hanging="280"/>
-        <w:jc w:val="left"/>
-        <w:rPr/>
-      </w:pPr>
-      <w:r>
-        <w:rPr>
-          <w:rFonts w:ascii="Times New Roman" w:cs="Times New Roman" w:eastAsia="Times New Roman" w:hAnsi="Times New Roman"/>
-          <w:b w:val="0"/>
-          <w:bCs w:val="0"/>
-          <w:i w:val="0"/>
-          <w:iCs w:val="0"/>
-          <w:smallCaps w:val="0"/>
-          <w:strike w:val="0"/>
-          <w:color w:val="000000"/>
-          <w:sz w:val="22"/>
-          <w:szCs w:val="22"/>
-          <w:u w:val="none"/>
-          <w:shd w:fill="auto" w:val="clear"/>
-          <w:vertAlign w:val="baseline"/>
-          <w:rtl w:val="0"/>
-        </w:rPr>
-        <w:t xml:space="preserve">¿El Responsable de Compras aprueba la solicitud? Si aprueba, el proveedor queda Activo; si no, queda Rechazado.</w:t>
-      </w:r>
-      <w:r>
-        <w:rPr>
-          <w:rtl w:val="0"/>
-        </w:rPr>
-      </w:r>
-    </w:p>
-    <w:p>
-      <w:pPr>
-        <w:pStyle w:val="Heading1"/>
-        <w:rPr/>
-      </w:pPr>
-      <w:r>
-        <w:rPr>
-          <w:rFonts w:ascii="Times New Roman" w:cs="Times New Roman" w:eastAsia="Times New Roman" w:hAnsi="Times New Roman"/>
-          <w:b w:val="1"/>
-          <w:bCs w:val="1"/>
-          <w:sz w:val="24"/>
-          <w:szCs w:val="24"/>
-          <w:rtl w:val="0"/>
-        </w:rPr>
         <w:t xml:space="preserve">5. MODELADO DEL PROCESO EN BPMN 2.0</w:t>
       </w:r>
       <w:r>
@@ -1044,7 +1058,7 @@
           <wp:inline distB="0" distT="0" distL="0" distR="0">
             <wp:extent cx="5715000" cy="2647950"/>
             <wp:effectExtent b="0" l="0" r="0" t="0"/>
-            <wp:docPr id="1" name="image1.png"/>
+            <wp:docPr id="4" name="image1.png"/>
             <a:graphic>
               <a:graphicData uri="http://schemas.openxmlformats.org/drawingml/2006/picture">
                 <pic:pic>
@@ -1343,48 +1357,372 @@
     </w:p>
     <w:p>
       <w:pPr>
-        <w:numPr>
-          <w:ilvl w:val="0"/>
-          <w:numId w:val="2"/>
-        </w:numPr>
+        <w:spacing w:after="120" w:line="276" w:lineRule="auto"/>
+        <w:jc w:val="both"/>
+        <w:rPr/>
+      </w:pPr>
+      <w:r>
+        <w:rPr>
+          <w:rtl w:val="0"/>
+        </w:rPr>
+        <w:t xml:space="preserve">Herramienta: Claude</w:t>
+      </w:r>
+    </w:p>
+    <w:p>
+      <w:pPr>
+        <w:spacing w:after="120" w:line="276" w:lineRule="auto"/>
+        <w:jc w:val="both"/>
+        <w:rPr/>
+      </w:pPr>
+      <w:r>
+        <w:rPr>
+          <w:rtl w:val="0"/>
+        </w:rPr>
+        <w:t xml:space="preserve">Prompt utilizado: "a partir de la descripción del proceso de alta de proveedores, </w:t>
+      </w:r>
+      <w:r>
+        <w:rPr>
+          <w:rtl w:val="0"/>
+        </w:rPr>
+        <w:t xml:space="preserve">generá</w:t>
+      </w:r>
+      <w:r>
+        <w:rPr>
+          <w:rtl w:val="0"/>
+        </w:rPr>
+        <w:t xml:space="preserve"> el diagrama BPMN 2.0 con sus compuertas de decisión". El diagrama obtenido se revisó para confirmar que </w:t>
+      </w:r>
+      <w:r>
+        <w:rPr>
+          <w:rtl w:val="0"/>
+        </w:rPr>
+        <w:t xml:space="preserve">representara</w:t>
+      </w:r>
+      <w:r>
+        <w:rPr>
+          <w:rtl w:val="0"/>
+        </w:rPr>
+        <w:t xml:space="preserve"> correctamente el flujo del proceso (validación del CUIT, evaluación del monto y aprobación), verificando que coincidiera con la lógica implementada en el código.</w:t>
+      </w:r>
+    </w:p>
+    <w:p>
+      <w:pPr>
         <w:spacing w:after="0" w:line="276" w:lineRule="auto"/>
-        <w:ind w:left="720" w:hanging="360"/>
+        <w:ind w:left="0" w:firstLine="0"/>
         <w:jc w:val="both"/>
         <w:rPr>
           <w:u w:val="none"/>
         </w:rPr>
       </w:pPr>
       <w:r>
-        <w:rPr>
-          <w:rtl w:val="0"/>
-        </w:rPr>
-        <w:t xml:space="preserve">Captura de gráfico</w:t>
-      </w:r>
-      <w:r>
-        <w:rPr>
-          <w:rtl w:val="0"/>
-        </w:rPr>
-      </w:r>
-    </w:p>
-    <w:p>
-      <w:pPr>
-        <w:numPr>
-          <w:ilvl w:val="0"/>
-          <w:numId w:val="2"/>
-        </w:numPr>
+        <w:rPr/>
+        <w:drawing>
+          <wp:inline distB="114300" distT="114300" distL="114300" distR="114300">
+            <wp:extent cx="4410075" cy="2943462"/>
+            <wp:effectExtent b="12700" l="12700" r="12700" t="12700"/>
+            <wp:docPr id="3" name="image4.png"/>
+            <a:graphic>
+              <a:graphicData uri="http://schemas.openxmlformats.org/drawingml/2006/picture">
+                <pic:pic>
+                  <pic:nvPicPr>
+                    <pic:cNvPr id="0" name="image4.png"/>
+                    <pic:cNvPicPr preferRelativeResize="0"/>
+                  </pic:nvPicPr>
+                  <pic:blipFill>
+                    <a:blip r:embed="rId8"/>
+                    <a:srcRect b="19727" l="0" r="6250" t="0"/>
+                    <a:stretch>
+                      <a:fillRect/>
+                    </a:stretch>
+                  </pic:blipFill>
+                  <pic:spPr>
+                    <a:xfrm>
+                      <a:off x="0" y="0"/>
+                      <a:ext cx="4410075" cy="2943462"/>
+                    </a:xfrm>
+                    <a:prstGeom prst="rect"/>
+                    <a:ln w="12700">
+                      <a:solidFill>
+                        <a:srgbClr val="999999"/>
+                      </a:solidFill>
+                      <a:prstDash val="dot"/>
+                    </a:ln>
+                  </pic:spPr>
+                </pic:pic>
+              </a:graphicData>
+            </a:graphic>
+          </wp:inline>
+        </w:drawing>
+      </w:r>
+      <w:r>
+        <w:rPr>
+          <w:rtl w:val="0"/>
+        </w:rPr>
+      </w:r>
+    </w:p>
+    <w:p>
+      <w:pPr>
         <w:spacing w:after="120" w:line="276" w:lineRule="auto"/>
-        <w:ind w:left="720" w:hanging="360"/>
+        <w:ind w:left="0" w:firstLine="0"/>
         <w:jc w:val="both"/>
-        <w:rPr>
-          <w:u w:val="none"/>
-        </w:rPr>
-      </w:pPr>
-      <w:r>
-        <w:rPr>
-          <w:rtl w:val="0"/>
-        </w:rPr>
-        <w:t xml:space="preserve">Captura de optimización de código</w:t>
-      </w:r>
+        <w:rPr/>
+      </w:pPr>
+      <w:r>
+        <w:rPr>
+          <w:rtl w:val="0"/>
+        </w:rPr>
+      </w:r>
+    </w:p>
+    <w:p>
+      <w:pPr>
+        <w:spacing w:after="120" w:line="276" w:lineRule="auto"/>
+        <w:ind w:left="0" w:firstLine="0"/>
+        <w:jc w:val="both"/>
+        <w:rPr/>
+      </w:pPr>
+      <w:r>
+        <w:rPr>
+          <w:rtl w:val="0"/>
+        </w:rPr>
+        <w:t xml:space="preserve">Herramienta: Gemini</w:t>
+      </w:r>
+    </w:p>
+    <w:p>
+      <w:pPr>
+        <w:spacing w:after="120" w:line="276" w:lineRule="auto"/>
+        <w:ind w:left="0" w:firstLine="0"/>
+        <w:jc w:val="both"/>
+        <w:rPr/>
+      </w:pPr>
+      <w:r>
+        <w:rPr>
+          <w:rtl w:val="0"/>
+        </w:rPr>
+        <w:t xml:space="preserve">Prompt utilizado: "optimizá este código para que sea más robusto y maneje cualquier error que un usuario pueda ingresar". La herramienta propuso varias mejoras, pero no todas resultaron adecuadas:</w:t>
+      </w:r>
+    </w:p>
+    <w:p>
+      <w:pPr>
+        <w:spacing w:after="120" w:line="276" w:lineRule="auto"/>
+        <w:ind w:left="0" w:firstLine="0"/>
+        <w:jc w:val="both"/>
+        <w:rPr/>
+      </w:pPr>
+      <w:r>
+        <w:rPr>
+          <w:rtl w:val="0"/>
+        </w:rPr>
+        <w:t xml:space="preserve">Se aceptaron cambios que aportaban robustez como la limpieza de espacios en los datos ingresados (.strip()) y la verificación de que el archivo CSV tuviera la columna esperada antes de leerla.</w:t>
+      </w:r>
+    </w:p>
+    <w:p>
+      <w:pPr>
+        <w:spacing w:after="120" w:line="276" w:lineRule="auto"/>
+        <w:ind w:left="0" w:firstLine="0"/>
+        <w:jc w:val="both"/>
+        <w:rPr/>
+      </w:pPr>
+      <w:r>
+        <w:rPr>
+          <w:rtl w:val="0"/>
+        </w:rPr>
+        <w:t xml:space="preserve">Se rechazó la validación del CUIT mediante el algoritmo del dígito verificador (módulo 11), por dos motivos: dejaba inválidos los datos de prueba ya cargados en la base, y </w:t>
+      </w:r>
+      <w:r>
+        <w:rPr>
+          <w:rtl w:val="0"/>
+        </w:rPr>
+        <w:t xml:space="preserve">excedía</w:t>
+      </w:r>
+      <w:r>
+        <w:rPr>
+          <w:rtl w:val="0"/>
+        </w:rPr>
+        <w:t xml:space="preserve"> el alcance del trabajo.</w:t>
+      </w:r>
+    </w:p>
+    <w:p>
+      <w:pPr>
+        <w:spacing w:after="120" w:line="276" w:lineRule="auto"/>
+        <w:ind w:left="0" w:firstLine="0"/>
+        <w:jc w:val="both"/>
+        <w:rPr/>
+      </w:pPr>
+      <w:r>
+        <w:rPr>
+          <w:rtl w:val="0"/>
+        </w:rPr>
+        <w:t xml:space="preserve">Se corrigió un error de la propuesta: usaba IOException, que no existe en Python y se reemplazó por OSError, que es la forma correcta.</w:t>
+      </w:r>
+    </w:p>
+    <w:p>
+      <w:pPr>
+        <w:spacing w:after="120" w:line="276" w:lineRule="auto"/>
+        <w:ind w:left="0" w:firstLine="0"/>
+        <w:jc w:val="both"/>
+        <w:rPr/>
+      </w:pPr>
+      <w:r>
+        <w:rPr/>
+        <w:drawing>
+          <wp:inline distB="114300" distT="114300" distL="114300" distR="114300">
+            <wp:extent cx="4424363" cy="2346492"/>
+            <wp:effectExtent b="0" l="0" r="0" t="0"/>
+            <wp:docPr id="2" name="image3.png"/>
+            <a:graphic>
+              <a:graphicData uri="http://schemas.openxmlformats.org/drawingml/2006/picture">
+                <pic:pic>
+                  <pic:nvPicPr>
+                    <pic:cNvPr id="0" name="image3.png"/>
+                    <pic:cNvPicPr preferRelativeResize="0"/>
+                  </pic:nvPicPr>
+                  <pic:blipFill>
+                    <a:blip r:embed="rId9"/>
+                    <a:srcRect b="0" l="0" r="0" t="0"/>
+                    <a:stretch>
+                      <a:fillRect/>
+                    </a:stretch>
+                  </pic:blipFill>
+                  <pic:spPr>
+                    <a:xfrm>
+                      <a:off x="0" y="0"/>
+                      <a:ext cx="4424363" cy="2346492"/>
+                    </a:xfrm>
+                    <a:prstGeom prst="rect"/>
+                    <a:ln/>
+                  </pic:spPr>
+                </pic:pic>
+              </a:graphicData>
+            </a:graphic>
+          </wp:inline>
+        </w:drawing>
+      </w:r>
+      <w:r>
+        <w:rPr>
+          <w:rtl w:val="0"/>
+        </w:rPr>
+      </w:r>
+    </w:p>
+    <w:p>
+      <w:pPr>
+        <w:spacing w:after="120" w:line="276" w:lineRule="auto"/>
+        <w:ind w:left="0" w:firstLine="0"/>
+        <w:jc w:val="both"/>
+        <w:rPr/>
+      </w:pPr>
+      <w:r>
+        <w:rPr/>
+        <w:drawing>
+          <wp:inline distB="114300" distT="114300" distL="114300" distR="114300">
+            <wp:extent cx="4438650" cy="2628900"/>
+            <wp:effectExtent b="0" l="0" r="0" t="0"/>
+            <wp:docPr id="1" name="image2.png"/>
+            <a:graphic>
+              <a:graphicData uri="http://schemas.openxmlformats.org/drawingml/2006/picture">
+                <pic:pic>
+                  <pic:nvPicPr>
+                    <pic:cNvPr id="0" name="image2.png"/>
+                    <pic:cNvPicPr preferRelativeResize="0"/>
+                  </pic:nvPicPr>
+                  <pic:blipFill>
+                    <a:blip r:embed="rId10"/>
+                    <a:srcRect b="0" l="0" r="0" t="41895"/>
+                    <a:stretch>
+                      <a:fillRect/>
+                    </a:stretch>
+                  </pic:blipFill>
+                  <pic:spPr>
+                    <a:xfrm>
+                      <a:off x="0" y="0"/>
+                      <a:ext cx="4438650" cy="2628900"/>
+                    </a:xfrm>
+                    <a:prstGeom prst="rect"/>
+                    <a:ln/>
+                  </pic:spPr>
+                </pic:pic>
+              </a:graphicData>
+            </a:graphic>
+          </wp:inline>
+        </w:drawing>
+      </w:r>
+      <w:r>
+        <w:rPr>
+          <w:rtl w:val="0"/>
+        </w:rPr>
+      </w:r>
+    </w:p>
+    <w:p>
+      <w:pPr>
+        <w:spacing w:after="120" w:line="276" w:lineRule="auto"/>
+        <w:ind w:left="0" w:firstLine="0"/>
+        <w:jc w:val="both"/>
+        <w:rPr/>
+      </w:pPr>
+      <w:r>
+        <w:rPr>
+          <w:rtl w:val="0"/>
+        </w:rPr>
+      </w:r>
+    </w:p>
+    <w:p>
+      <w:pPr>
+        <w:spacing w:after="120" w:line="276" w:lineRule="auto"/>
+        <w:ind w:left="0" w:firstLine="0"/>
+        <w:jc w:val="both"/>
+        <w:rPr/>
+      </w:pPr>
+      <w:r>
+        <w:rPr>
+          <w:rtl w:val="0"/>
+        </w:rPr>
+        <w:t xml:space="preserve">Herramienta: ChatGPT</w:t>
+      </w:r>
+    </w:p>
+    <w:p>
+      <w:pPr>
+        <w:spacing w:after="120" w:line="276" w:lineRule="auto"/>
+        <w:ind w:left="0" w:firstLine="0"/>
+        <w:jc w:val="both"/>
+        <w:rPr/>
+      </w:pPr>
+      <w:r>
+        <w:rPr>
+          <w:rtl w:val="0"/>
+        </w:rPr>
+        <w:t xml:space="preserve">Prompt utilizado: </w:t>
+      </w:r>
+    </w:p>
+    <w:p>
+      <w:pPr>
+        <w:spacing w:after="120" w:line="276" w:lineRule="auto"/>
+        <w:ind w:left="0" w:firstLine="0"/>
+        <w:jc w:val="both"/>
+        <w:rPr/>
+      </w:pPr>
+      <w:r>
+        <w:rPr>
+          <w:rtl w:val="0"/>
+        </w:rPr>
+      </w:r>
+    </w:p>
+    <w:p>
+      <w:pPr>
+        <w:spacing w:after="120" w:line="276" w:lineRule="auto"/>
+        <w:ind w:left="0" w:firstLine="0"/>
+        <w:jc w:val="both"/>
+        <w:rPr/>
+      </w:pPr>
+      <w:r>
+        <w:rPr>
+          <w:rtl w:val="0"/>
+        </w:rPr>
+      </w:r>
+    </w:p>
+    <w:p>
+      <w:pPr>
+        <w:spacing w:after="80" w:before="160" w:lineRule="auto"/>
+        <w:rPr/>
+      </w:pPr>
       <w:r>
         <w:rPr>
           <w:rtl w:val="0"/>
@@ -2711,7 +3049,7 @@
             </w:pPr>
             <w:sdt>
               <w:sdtPr>
-                <w:id w:val="-705673070"/>
+                <w:id w:val="-622310820"/>
                 <w:tag w:val="goog_rdk_0"/>
               </w:sdtPr>
               <w:sdtContent>
@@ -4022,7 +4360,7 @@
             </w:pPr>
             <w:sdt>
               <w:sdtPr>
-                <w:id w:val="1771702892"/>
+                <w:id w:val="1666011824"/>
                 <w:tag w:val="goog_rdk_1"/>
               </w:sdtPr>
               <w:sdtContent>
@@ -4498,7 +4836,7 @@
             </w:pPr>
             <w:sdt>
               <w:sdtPr>
-                <w:id w:val="-1662000577"/>
+                <w:id w:val="288306732"/>
                 <w:tag w:val="goog_rdk_2"/>
               </w:sdtPr>
               <w:sdtContent>
@@ -5416,7 +5754,7 @@
         <w:widowControl w:val="1"/>
         <w:numPr>
           <w:ilvl w:val="0"/>
-          <w:numId w:val="5"/>
+          <w:numId w:val="4"/>
         </w:numPr>
         <w:pBdr>
           <w:top w:space="0" w:sz="0" w:val="nil"/>
@@ -5464,7 +5802,7 @@
         <w:widowControl w:val="1"/>
         <w:numPr>
           <w:ilvl w:val="0"/>
-          <w:numId w:val="5"/>
+          <w:numId w:val="4"/>
         </w:numPr>
         <w:pBdr>
           <w:top w:space="0" w:sz="0" w:val="nil"/>
@@ -5512,7 +5850,7 @@
         <w:widowControl w:val="1"/>
         <w:numPr>
           <w:ilvl w:val="0"/>
-          <w:numId w:val="5"/>
+          <w:numId w:val="4"/>
         </w:numPr>
         <w:pBdr>
           <w:top w:space="0" w:sz="0" w:val="nil"/>
@@ -5560,7 +5898,7 @@
         <w:widowControl w:val="1"/>
         <w:numPr>
           <w:ilvl w:val="0"/>
-          <w:numId w:val="5"/>
+          <w:numId w:val="4"/>
         </w:numPr>
         <w:pBdr>
           <w:top w:space="0" w:sz="0" w:val="nil"/>
@@ -5608,7 +5946,7 @@
         <w:widowControl w:val="1"/>
         <w:numPr>
           <w:ilvl w:val="0"/>
-          <w:numId w:val="5"/>
+          <w:numId w:val="4"/>
         </w:numPr>
         <w:pBdr>
           <w:top w:space="0" w:sz="0" w:val="nil"/>
@@ -5656,7 +5994,7 @@
         <w:widowControl w:val="1"/>
         <w:numPr>
           <w:ilvl w:val="0"/>
-          <w:numId w:val="5"/>
+          <w:numId w:val="4"/>
         </w:numPr>
         <w:pBdr>
           <w:top w:space="0" w:sz="0" w:val="nil"/>
@@ -6657,7 +6995,7 @@
             </w:pPr>
             <w:sdt>
               <w:sdtPr>
-                <w:id w:val="-1655023219"/>
+                <w:id w:val="1812334440"/>
                 <w:tag w:val="goog_rdk_3"/>
               </w:sdtPr>
               <w:sdtContent>
@@ -7252,7 +7590,7 @@
         <w:widowControl w:val="1"/>
         <w:numPr>
           <w:ilvl w:val="0"/>
-          <w:numId w:val="3"/>
+          <w:numId w:val="2"/>
         </w:numPr>
         <w:pBdr>
           <w:top w:space="0" w:sz="0" w:val="nil"/>
@@ -7300,7 +7638,7 @@
         <w:widowControl w:val="1"/>
         <w:numPr>
           <w:ilvl w:val="0"/>
-          <w:numId w:val="3"/>
+          <w:numId w:val="2"/>
         </w:numPr>
         <w:pBdr>
           <w:top w:space="0" w:sz="0" w:val="nil"/>
@@ -7348,7 +7686,7 @@
         <w:widowControl w:val="1"/>
         <w:numPr>
           <w:ilvl w:val="0"/>
-          <w:numId w:val="3"/>
+          <w:numId w:val="2"/>
         </w:numPr>
         <w:pBdr>
           <w:top w:space="0" w:sz="0" w:val="nil"/>
@@ -7396,7 +7734,7 @@
         <w:widowControl w:val="1"/>
         <w:numPr>
           <w:ilvl w:val="0"/>
-          <w:numId w:val="3"/>
+          <w:numId w:val="2"/>
         </w:numPr>
         <w:pBdr>
           <w:top w:space="0" w:sz="0" w:val="nil"/>
@@ -7487,18 +7825,36 @@
         </w:numPr>
         <w:spacing w:after="120" w:lineRule="auto"/>
         <w:ind w:left="720" w:hanging="360"/>
-        <w:rPr/>
-      </w:pPr>
-      <w:r>
-        <w:rPr>
-          <w:color w:val="0000ff"/>
+      </w:pPr>
+      <w:r>
+        <w:rPr>
+          <w:sz w:val="24"/>
+          <w:szCs w:val="24"/>
           <w:rtl w:val="0"/>
         </w:rPr>
         <w:t xml:space="preserve">https://github.com/martufn/Alta-de-Proveedores.git</w:t>
       </w:r>
+      <w:r>
+        <w:rPr>
+          <w:rtl w:val="0"/>
+        </w:rPr>
+        <w:t xml:space="preserve"> </w:t>
+      </w:r>
+    </w:p>
+    <w:p>
+      <w:pPr>
+        <w:spacing w:after="120" w:lineRule="auto"/>
+        <w:ind w:left="0" w:firstLine="0"/>
+        <w:rPr/>
+      </w:pPr>
+      <w:r>
+        <w:rPr>
+          <w:rtl w:val="0"/>
+        </w:rPr>
+      </w:r>
     </w:p>
     <w:sectPr>
-      <w:footerReference r:id="rId8" w:type="default"/>
+      <w:footerReference r:id="rId11" w:type="default"/>
       <w:pgSz w:h="16838" w:w="11906" w:orient="portrait"/>
       <w:pgMar w:bottom="1440" w:top="1440" w:left="1440" w:right="1440" w:header="708" w:footer="708"/>
       <w:pgNumType w:start="1"/>
@@ -7557,7 +7913,6 @@
         <w:ind w:left="720" w:hanging="360"/>
       </w:pPr>
       <w:rPr>
-        <w:color w:val="000000"/>
         <w:u w:val="none"/>
       </w:rPr>
     </w:lvl>
@@ -7662,116 +8017,6 @@
     <w:lvl w:ilvl="0">
       <w:start w:val="1"/>
       <w:numFmt w:val="bullet"/>
-      <w:lvlText w:val="●"/>
-      <w:lvlJc w:val="left"/>
-      <w:pPr>
-        <w:ind w:left="720" w:hanging="360"/>
-      </w:pPr>
-      <w:rPr>
-        <w:u w:val="none"/>
-      </w:rPr>
-    </w:lvl>
-    <w:lvl w:ilvl="1">
-      <w:start w:val="1"/>
-      <w:numFmt w:val="bullet"/>
-      <w:lvlText w:val="○"/>
-      <w:lvlJc w:val="left"/>
-      <w:pPr>
-        <w:ind w:left="1440" w:hanging="360"/>
-      </w:pPr>
-      <w:rPr>
-        <w:u w:val="none"/>
-      </w:rPr>
-    </w:lvl>
-    <w:lvl w:ilvl="2">
-      <w:start w:val="1"/>
-      <w:numFmt w:val="bullet"/>
-      <w:lvlText w:val="■"/>
-      <w:lvlJc w:val="left"/>
-      <w:pPr>
-        <w:ind w:left="2160" w:hanging="360"/>
-      </w:pPr>
-      <w:rPr>
-        <w:u w:val="none"/>
-      </w:rPr>
-    </w:lvl>
-    <w:lvl w:ilvl="3">
-      <w:start w:val="1"/>
-      <w:numFmt w:val="bullet"/>
-      <w:lvlText w:val="●"/>
-      <w:lvlJc w:val="left"/>
-      <w:pPr>
-        <w:ind w:left="2880" w:hanging="360"/>
-      </w:pPr>
-      <w:rPr>
-        <w:u w:val="none"/>
-      </w:rPr>
-    </w:lvl>
-    <w:lvl w:ilvl="4">
-      <w:start w:val="1"/>
-      <w:numFmt w:val="bullet"/>
-      <w:lvlText w:val="○"/>
-      <w:lvlJc w:val="left"/>
-      <w:pPr>
-        <w:ind w:left="3600" w:hanging="360"/>
-      </w:pPr>
-      <w:rPr>
-        <w:u w:val="none"/>
-      </w:rPr>
-    </w:lvl>
-    <w:lvl w:ilvl="5">
-      <w:start w:val="1"/>
-      <w:numFmt w:val="bullet"/>
-      <w:lvlText w:val="■"/>
-      <w:lvlJc w:val="left"/>
-      <w:pPr>
-        <w:ind w:left="4320" w:hanging="360"/>
-      </w:pPr>
-      <w:rPr>
-        <w:u w:val="none"/>
-      </w:rPr>
-    </w:lvl>
-    <w:lvl w:ilvl="6">
-      <w:start w:val="1"/>
-      <w:numFmt w:val="bullet"/>
-      <w:lvlText w:val="●"/>
-      <w:lvlJc w:val="left"/>
-      <w:pPr>
-        <w:ind w:left="5040" w:hanging="360"/>
-      </w:pPr>
-      <w:rPr>
-        <w:u w:val="none"/>
-      </w:rPr>
-    </w:lvl>
-    <w:lvl w:ilvl="7">
-      <w:start w:val="1"/>
-      <w:numFmt w:val="bullet"/>
-      <w:lvlText w:val="○"/>
-      <w:lvlJc w:val="left"/>
-      <w:pPr>
-        <w:ind w:left="5760" w:hanging="360"/>
-      </w:pPr>
-      <w:rPr>
-        <w:u w:val="none"/>
-      </w:rPr>
-    </w:lvl>
-    <w:lvl w:ilvl="8">
-      <w:start w:val="1"/>
-      <w:numFmt w:val="bullet"/>
-      <w:lvlText w:val="■"/>
-      <w:lvlJc w:val="left"/>
-      <w:pPr>
-        <w:ind w:left="6480" w:hanging="360"/>
-      </w:pPr>
-      <w:rPr>
-        <w:u w:val="none"/>
-      </w:rPr>
-    </w:lvl>
-  </w:abstractNum>
-  <w:abstractNum w:abstractNumId="3">
-    <w:lvl w:ilvl="0">
-      <w:start w:val="1"/>
-      <w:numFmt w:val="bullet"/>
       <w:lvlText w:val="•"/>
       <w:lvlJc w:val="left"/>
       <w:pPr>
@@ -7860,7 +8105,7 @@
       <w:rPr/>
     </w:lvl>
   </w:abstractNum>
-  <w:abstractNum w:abstractNumId="4">
+  <w:abstractNum w:abstractNumId="3">
     <w:lvl w:ilvl="0">
       <w:start w:val="1"/>
       <w:numFmt w:val="decimal"/>
@@ -7952,7 +8197,7 @@
       <w:rPr/>
     </w:lvl>
   </w:abstractNum>
-  <w:abstractNum w:abstractNumId="5">
+  <w:abstractNum w:abstractNumId="4">
     <w:lvl w:ilvl="0">
       <w:start w:val="1"/>
       <w:numFmt w:val="decimal"/>
@@ -8055,9 +8300,6 @@
   </w:num>
   <w:num w:numId="4">
     <w:abstractNumId w:val="4"/>
-  </w:num>
-  <w:num w:numId="5">
-    <w:abstractNumId w:val="5"/>
   </w:num>
 </w:numbering>
 </file>
@@ -8731,7 +8973,7 @@
 
 <file path=customXML/item1.xml><?xml version="1.0" encoding="utf-8"?>
 <go:gDocsCustomXmlDataStorage xmlns:go="http://customooxmlschemas.google.com/" xmlns:r="http://schemas.openxmlformats.org/officeDocument/2006/relationships" uri="GoogleDocsCustomDataVersion2">
-  <go:docsCustomData xmlns:go="http://customooxmlschemas.google.com/" roundtripDataSignature="AMtx7mj6M+6qRt6cnzDHEW5I/5XFjB3p1w==">CgMxLjAaJQoBMBIgCh4IB0IaCg9UaW1lcyBOZXcgUm9tYW4SB0d1bmdzdWgaJQoBMRIgCh4IB0IaCg9UaW1lcyBOZXcgUm9tYW4SB0d1bmdzdWgaJQoBMhIgCh4IB0IaCg9UaW1lcyBOZXcgUm9tYW4SB0d1bmdzdWgaJQoBMxIgCh4IB0IaCg9UaW1lcyBOZXcgUm9tYW4SB0d1bmdzdWg4AHIhMXdESDgzWldxLVBjNWdva3BnVXNvVTJxbFd4NEhHWlZJ</go:docsCustomData>
+  <go:docsCustomData xmlns:go="http://customooxmlschemas.google.com/" roundtripDataSignature="AMtx7mjJ6jgnpOg2cRgrtKC83IBjv1itgg==">CgMxLjAaJQoBMBIgCh4IB0IaCg9UaW1lcyBOZXcgUm9tYW4SB0d1bmdzdWgaJQoBMRIgCh4IB0IaCg9UaW1lcyBOZXcgUm9tYW4SB0d1bmdzdWgaJQoBMhIgCh4IB0IaCg9UaW1lcyBOZXcgUm9tYW4SB0d1bmdzdWgaJQoBMxIgCh4IB0IaCg9UaW1lcyBOZXcgUm9tYW4SB0d1bmdzdWg4AHIhMWhnTGVuMDFaMWlOM1lBMS1fUTJTNUFSTVRRYkxkSVho</go:docsCustomData>
 </go:gDocsCustomXmlDataStorage>
 </file>
 

</xml_diff>